<commit_message>
agent improvements (~70% less tool calls)
</commit_message>
<xml_diff>
--- a/backend/output/workpaper_bpc-001.docx
+++ b/backend/output/workpaper_bpc-001.docx
@@ -122,19 +122,25 @@
       <w:r>
         <w:t>1. Load data/invoices.csv and data/purchase_orders.csv using load_evidence.</w:t>
         <w:br/>
-        <w:t>2. Join the two datasets on PONumber using join_datasets.</w:t>
+        <w:t>2. Join the two datasets on PONumber using join_datasets so each invoice row has its PO and goods receipt data.</w:t>
         <w:br/>
-        <w:t>3. For each record, check if a matching PO exists. If join returns null POAmount (no PO found), flag as exception — payment made with no authorized PO.</w:t>
+        <w:t>3. In memory, for every joined row compute:</w:t>
         <w:br/>
-        <w:t>4. Calculate the percentage variance between InvoiceAmount and POAmount: abs(InvoiceAmount - POAmount) / POAmount * 100.</w:t>
+        <w:t xml:space="preserve">   - variance_po = abs(InvoiceAmount - POAmount) / POAmount * 100</w:t>
         <w:br/>
-        <w:t>5. Also calculate variance between InvoiceAmount and GoodsReceiptAmount using the same formula.</w:t>
+        <w:t xml:space="preserve">   - variance_gr = abs(InvoiceAmount - GoodsReceiptAmount) / GoodsReceiptAmount * 100</w:t>
         <w:br/>
-        <w:t>6. If either variance exceeds 1.0%, flag as exception with the specific amounts and variance percentage in the finding detail.</w:t>
+        <w:t>4. Build a list of findings with one entry per invoice:</w:t>
         <w:br/>
-        <w:t>7. Otherwise flag as pass.</w:t>
+        <w:t xml:space="preserve">   - If POAmount is null (no PO found), set result = EXCEPTION with finding_detail explaining that payment was made without an authorized PO.</w:t>
         <w:br/>
-        <w:t>8. Generate workpaper when all samples are evaluated.</w:t>
+        <w:t xml:space="preserve">   - Else if either variance_po or variance_gr exceeds 1.0, set result = EXCEPTION with finding_detail including the relevant amounts and variance percentages.</w:t>
+        <w:br/>
+        <w:t xml:space="preserve">   - Otherwise set result = PASS.</w:t>
+        <w:br/>
+        <w:t>5. Call flag_findings_batch once with the full list of findings (each item containing sample_id, sample_identifier, result, evidence_citations, and for exceptions the finding_detail).</w:t>
+        <w:br/>
+        <w:t>6. Call generate_workpaper with total_samples, exceptions, and conclusion once all samples are evaluated.</w:t>
       </w:r>
     </w:p>
     <w:p>
@@ -149,9 +155,9 @@
       <w:r>
         <w:t>Total Samples Tested: 10</w:t>
         <w:br/>
-        <w:t>Total Exceptions Identified: 2</w:t>
+        <w:t>Total Exceptions Identified: 3</w:t>
         <w:br/>
-        <w:t>Exception Rate: 20.00%</w:t>
+        <w:t>Exception Rate: 30.00%</w:t>
       </w:r>
     </w:p>
     <w:p>
@@ -223,7 +229,7 @@
           </w:tcPr>
           <w:p>
             <w:r>
-              <w:t>INV-001</w:t>
+              <w:t>1</w:t>
             </w:r>
           </w:p>
         </w:tc>
@@ -233,7 +239,7 @@
           </w:tcPr>
           <w:p>
             <w:r>
-              <w:t>PO-2026-001</w:t>
+              <w:t>INV-001</w:t>
             </w:r>
           </w:p>
         </w:tc>
@@ -253,7 +259,7 @@
           </w:tcPr>
           <w:p>
             <w:r>
-              <w:t>data/invoices.csv, data/purchase_orders.csv, Control: BPC-001</w:t>
+              <w:t>data/invoices.csv, data/purchase_orders.csv</w:t>
             </w:r>
           </w:p>
         </w:tc>
@@ -265,7 +271,7 @@
           </w:tcPr>
           <w:p>
             <w:r>
-              <w:t>INV-002</w:t>
+              <w:t>2</w:t>
             </w:r>
           </w:p>
         </w:tc>
@@ -275,7 +281,7 @@
           </w:tcPr>
           <w:p>
             <w:r>
-              <w:t>PO-2026-002</w:t>
+              <w:t>INV-002</w:t>
             </w:r>
           </w:p>
         </w:tc>
@@ -295,7 +301,7 @@
           </w:tcPr>
           <w:p>
             <w:r>
-              <w:t>data/invoices.csv, data/purchase_orders.csv, Control: BPC-001</w:t>
+              <w:t>data/invoices.csv, data/purchase_orders.csv</w:t>
             </w:r>
           </w:p>
         </w:tc>
@@ -307,7 +313,7 @@
           </w:tcPr>
           <w:p>
             <w:r>
-              <w:t>INV-003</w:t>
+              <w:t>3</w:t>
             </w:r>
           </w:p>
         </w:tc>
@@ -317,7 +323,7 @@
           </w:tcPr>
           <w:p>
             <w:r>
-              <w:t>PO-2026-003</w:t>
+              <w:t>INV-003</w:t>
             </w:r>
           </w:p>
         </w:tc>
@@ -337,7 +343,7 @@
           </w:tcPr>
           <w:p>
             <w:r>
-              <w:t>data/invoices.csv, data/purchase_orders.csv, Control: BPC-001</w:t>
+              <w:t>data/invoices.csv, data/purchase_orders.csv</w:t>
             </w:r>
           </w:p>
         </w:tc>
@@ -349,7 +355,7 @@
           </w:tcPr>
           <w:p>
             <w:r>
-              <w:t>INV-004</w:t>
+              <w:t>4</w:t>
             </w:r>
           </w:p>
         </w:tc>
@@ -359,7 +365,7 @@
           </w:tcPr>
           <w:p>
             <w:r>
-              <w:t>PO-2026-004</w:t>
+              <w:t>INV-004</w:t>
             </w:r>
           </w:p>
         </w:tc>
@@ -379,7 +385,7 @@
           </w:tcPr>
           <w:p>
             <w:r>
-              <w:t>data/invoices.csv, data/purchase_orders.csv, Control: BPC-001</w:t>
+              <w:t>data/invoices.csv, data/purchase_orders.csv</w:t>
             </w:r>
           </w:p>
         </w:tc>
@@ -391,7 +397,7 @@
           </w:tcPr>
           <w:p>
             <w:r>
-              <w:t>INV-005</w:t>
+              <w:t>5</w:t>
             </w:r>
           </w:p>
         </w:tc>
@@ -401,7 +407,7 @@
           </w:tcPr>
           <w:p>
             <w:r>
-              <w:t>PO-2026-005</w:t>
+              <w:t>INV-005</w:t>
             </w:r>
           </w:p>
         </w:tc>
@@ -421,7 +427,7 @@
           </w:tcPr>
           <w:p>
             <w:r>
-              <w:t>data/invoices.csv, data/purchase_orders.csv, Control: BPC-001</w:t>
+              <w:t>data/invoices.csv, data/purchase_orders.csv</w:t>
             </w:r>
           </w:p>
         </w:tc>
@@ -433,7 +439,7 @@
           </w:tcPr>
           <w:p>
             <w:r>
-              <w:t>INV-006</w:t>
+              <w:t>6</w:t>
             </w:r>
           </w:p>
         </w:tc>
@@ -443,7 +449,7 @@
           </w:tcPr>
           <w:p>
             <w:r>
-              <w:t>PO-2026-006</w:t>
+              <w:t>INV-006</w:t>
             </w:r>
           </w:p>
         </w:tc>
@@ -463,7 +469,7 @@
           </w:tcPr>
           <w:p>
             <w:r>
-              <w:t>data/invoices.csv, data/purchase_orders.csv, Control: BPC-001</w:t>
+              <w:t>data/invoices.csv, data/purchase_orders.csv</w:t>
             </w:r>
           </w:p>
         </w:tc>
@@ -475,7 +481,7 @@
           </w:tcPr>
           <w:p>
             <w:r>
-              <w:t>INV-007</w:t>
+              <w:t>7</w:t>
             </w:r>
           </w:p>
         </w:tc>
@@ -485,7 +491,7 @@
           </w:tcPr>
           <w:p>
             <w:r>
-              <w:t>PO-2026-007</w:t>
+              <w:t>INV-007</w:t>
             </w:r>
           </w:p>
         </w:tc>
@@ -505,7 +511,7 @@
           </w:tcPr>
           <w:p>
             <w:r>
-              <w:t>data/invoices.csv, data/purchase_orders.csv, Control: BPC-001</w:t>
+              <w:t>data/invoices.csv, data/purchase_orders.csv</w:t>
             </w:r>
           </w:p>
         </w:tc>
@@ -517,7 +523,7 @@
           </w:tcPr>
           <w:p>
             <w:r>
-              <w:t>INV-008</w:t>
+              <w:t>8</w:t>
             </w:r>
           </w:p>
         </w:tc>
@@ -527,7 +533,7 @@
           </w:tcPr>
           <w:p>
             <w:r>
-              <w:t>PO-2026-008</w:t>
+              <w:t>INV-008</w:t>
             </w:r>
           </w:p>
         </w:tc>
@@ -547,7 +553,7 @@
           </w:tcPr>
           <w:p>
             <w:r>
-              <w:t>data/invoices.csv, data/purchase_orders.csv, Control: BPC-001</w:t>
+              <w:t>data/invoices.csv, data/purchase_orders.csv</w:t>
             </w:r>
           </w:p>
         </w:tc>
@@ -559,7 +565,7 @@
           </w:tcPr>
           <w:p>
             <w:r>
-              <w:t>INV-009</w:t>
+              <w:t>9</w:t>
             </w:r>
           </w:p>
         </w:tc>
@@ -569,49 +575,7 @@
           </w:tcPr>
           <w:p>
             <w:r>
-              <w:t>PO-2026-009</w:t>
-            </w:r>
-          </w:p>
-        </w:tc>
-        <w:tc>
-          <w:tcPr>
-            <w:tcW w:type="dxa" w:w="2160"/>
-          </w:tcPr>
-          <w:p>
-            <w:r>
-              <w:t>PASS</w:t>
-            </w:r>
-          </w:p>
-        </w:tc>
-        <w:tc>
-          <w:tcPr>
-            <w:tcW w:type="dxa" w:w="2160"/>
-          </w:tcPr>
-          <w:p>
-            <w:r>
-              <w:t>data/invoices.csv, data/purchase_orders.csv, Control: BPC-001</w:t>
-            </w:r>
-          </w:p>
-        </w:tc>
-      </w:tr>
-      <w:tr>
-        <w:tc>
-          <w:tcPr>
-            <w:tcW w:type="dxa" w:w="2160"/>
-          </w:tcPr>
-          <w:p>
-            <w:r>
-              <w:t>INV-010</w:t>
-            </w:r>
-          </w:p>
-        </w:tc>
-        <w:tc>
-          <w:tcPr>
-            <w:tcW w:type="dxa" w:w="2160"/>
-          </w:tcPr>
-          <w:p>
-            <w:r>
-              <w:t>PO-2026-010</w:t>
+              <w:t>INV-009</w:t>
             </w:r>
           </w:p>
         </w:tc>
@@ -631,7 +595,49 @@
           </w:tcPr>
           <w:p>
             <w:r>
-              <w:t>data/invoices.csv, data/purchase_orders.csv, Control: BPC-001</w:t>
+              <w:t>data/invoices.csv, data/purchase_orders.csv</w:t>
+            </w:r>
+          </w:p>
+        </w:tc>
+      </w:tr>
+      <w:tr>
+        <w:tc>
+          <w:tcPr>
+            <w:tcW w:type="dxa" w:w="2160"/>
+          </w:tcPr>
+          <w:p>
+            <w:r>
+              <w:t>10</w:t>
+            </w:r>
+          </w:p>
+        </w:tc>
+        <w:tc>
+          <w:tcPr>
+            <w:tcW w:type="dxa" w:w="2160"/>
+          </w:tcPr>
+          <w:p>
+            <w:r>
+              <w:t>INV-010</w:t>
+            </w:r>
+          </w:p>
+        </w:tc>
+        <w:tc>
+          <w:tcPr>
+            <w:tcW w:type="dxa" w:w="2160"/>
+          </w:tcPr>
+          <w:p>
+            <w:r>
+              <w:t>EXCEPTION</w:t>
+            </w:r>
+          </w:p>
+        </w:tc>
+        <w:tc>
+          <w:tcPr>
+            <w:tcW w:type="dxa" w:w="2160"/>
+          </w:tcPr>
+          <w:p>
+            <w:r>
+              <w:t>data/invoices.csv, data/purchase_orders.csv</w:t>
             </w:r>
           </w:p>
         </w:tc>
@@ -650,10 +656,10 @@
         <w:rPr>
           <w:b/>
         </w:rPr>
-        <w:t xml:space="preserve">Sample INV-008 (PO-2026-008): </w:t>
+        <w:t xml:space="preserve">Sample 8 (INV-008): </w:t>
       </w:r>
       <w:r>
-        <w:t>InvoiceAmount 11881.56 vs POAmount 10331.79 =&gt; variance 14.99% (exceeds 1%).</w:t>
+        <w:t>Invoice INV-008 (PONumber PO-2026-008): InvoiceAmount=11881.56, POAmount=10331.79, GoodsReceiptAmount=10331.79. variance_po=15.01%, variance_gr=15.01% (exceeds 1% tolerance).</w:t>
       </w:r>
     </w:p>
     <w:p>
@@ -672,10 +678,32 @@
         <w:rPr>
           <w:b/>
         </w:rPr>
-        <w:t xml:space="preserve">Sample INV-010 (PO-2026-010): </w:t>
+        <w:t xml:space="preserve">Sample 9 (INV-009): </w:t>
       </w:r>
       <w:r>
-        <w:t>No matching PO found for PONumber PO-2026-010 — payment made without authorized PO.</w:t>
+        <w:t>Invoice INV-009 (PONumber PO-2026-009): InvoiceAmount=39183.48, POAmount=39183.48, GoodsReceiptAmount=23510.09. variance_po=0.00%, variance_gr=66.69% (exceeds 1% tolerance).</w:t>
+      </w:r>
+    </w:p>
+    <w:p>
+      <w:r>
+        <w:rPr>
+          <w:i/>
+        </w:rPr>
+        <w:t xml:space="preserve">Management Response: </w:t>
+      </w:r>
+      <w:r>
+        <w:t>Pending Input</w:t>
+      </w:r>
+    </w:p>
+    <w:p>
+      <w:r>
+        <w:rPr>
+          <w:b/>
+        </w:rPr>
+        <w:t xml:space="preserve">Sample 10 (INV-010): </w:t>
+      </w:r>
+      <w:r>
+        <w:t>Invoice INV-010 (PONumber PO-2026-010): No matching PO found (POAmount missing) — payment made without an authorized PO.</w:t>
       </w:r>
     </w:p>
     <w:p>
@@ -702,7 +730,7 @@
         <w:rPr>
           <w:b/>
         </w:rPr>
-        <w:t>Control failed: 2 exceptions identified out of 10 samples (20%). Exceptions include one invoice with &gt;1% variance (INV-008) and one invoice with no matching PO (INV-010).</w:t>
+        <w:t>Control exceptions identified in 3 of 10 invoices (30%). Exceptions: two variances exceeded tolerance and one invoice had no matching PO. Control does not fully operate effectively.</w:t>
       </w:r>
     </w:p>
     <w:sectPr>

</xml_diff>